<commit_message>
Anotación de capturas, resumen ejecutivo, pantalla/flujo y multi-captura
Co-Authored-By: Claude Fable 5 <noreply@anthropic.com>
</commit_message>
<xml_diff>
--- a/docs/prompts_leyes_heuristicas.docx
+++ b/docs/prompts_leyes_heuristicas.docx
@@ -106,7 +106,7 @@
         </w:rPr>
         <w:t xml:space="preserve">Tablero en línea: </w:t>
       </w:r>
-      <w:hyperlink w:history="1" r:id="rIdwsbslukxu9v0-k4fqy3ys">
+      <w:hyperlink w:history="1" r:id="rIdqs7pkuixyzr-dvdupeqes">
         <w:r>
           <w:rPr>
             <w:rStyle w:val="Hyperlink"/>
@@ -131,7 +131,7 @@
         </w:rPr>
         <w:t xml:space="preserve">Repositorio: </w:t>
       </w:r>
-      <w:hyperlink w:history="1" r:id="rIdxef2umgvkxpaecdwlbo8o">
+      <w:hyperlink w:history="1" r:id="rIdmmrypcj6grr-1fljbfuyy">
         <w:r>
           <w:rPr>
             <w:rStyle w:val="Hyperlink"/>
@@ -304,6 +304,147 @@
       </w:pPr>
       <w:r>
         <w:t xml:space="preserve">Finalmente creó el repositorio público en GitHub, hizo el commit inicial y el deploy a producción en Vercel con el CLI (vercel deploy --prod). El único paso manual fue autorizar el login de Vercel en el navegador.</w:t>
+      </w:r>
+    </w:p>
+    <w:p>
+      <w:pPr>
+        <w:pStyle w:val="Heading2"/>
+        <w:spacing w:after="160" w:before="240"/>
+      </w:pPr>
+      <w:r>
+        <w:t xml:space="preserve">Prompt 2 — Mejoras: anotación de capturas, resumen ejecutivo y multi-captura</w:t>
+      </w:r>
+    </w:p>
+    <w:p>
+      <w:pPr>
+        <w:spacing w:after="160"/>
+      </w:pPr>
+      <w:r>
+        <w:rPr>
+          <w:b/>
+          <w:bCs/>
+        </w:rPr>
+        <w:t xml:space="preserve">Herramienta de IA usada: </w:t>
+      </w:r>
+      <w:r>
+        <w:t xml:space="preserve">Claude Code (Claude Fable 5).</w:t>
+      </w:r>
+    </w:p>
+    <w:p>
+      <w:pPr>
+        <w:spacing w:after="160"/>
+      </w:pPr>
+      <w:r>
+        <w:rPr>
+          <w:b/>
+          <w:bCs/>
+        </w:rPr>
+        <w:t xml:space="preserve">Objetivo del prompt: </w:t>
+      </w:r>
+      <w:r>
+        <w:t xml:space="preserve">pedirle a la IA ideas para mejorar la herramienta y que implemente las elegidas. Antes preguntamos si la app debía evaluar automáticamente lo subido; la IA aclaró que no: la consigna pide una herramienta de documentación donde el juicio (cumple/rompe, severidad) es del equipo, y que automatizar el análisis iría contra el objetivo pedagógico de la tarea.</w:t>
+      </w:r>
+    </w:p>
+    <w:p>
+      <w:pPr>
+        <w:spacing w:after="160"/>
+      </w:pPr>
+      <w:r>
+        <w:rPr>
+          <w:b/>
+          <w:bCs/>
+        </w:rPr>
+        <w:t xml:space="preserve">Prompt completo (texto exacto):</w:t>
+      </w:r>
+    </w:p>
+    <w:p>
+      <w:pPr>
+        <w:pBdr>
+          <w:left w:val="single" w:color="4338CA" w:sz="18" w:space="8"/>
+        </w:pBdr>
+        <w:spacing w:after="160"/>
+        <w:ind w:left="480"/>
+      </w:pPr>
+      <w:r>
+        <w:rPr>
+          <w:i/>
+          <w:iCs/>
+        </w:rPr>
+        <w:t xml:space="preserve">pregunta, la idea de la webapp era que yo decida que cumple y que no o que la misma app cuando le subis algo lo decida?</w:t>
+      </w:r>
+    </w:p>
+    <w:p>
+      <w:pPr>
+        <w:pBdr>
+          <w:left w:val="single" w:color="4338CA" w:sz="18" w:space="8"/>
+        </w:pBdr>
+        <w:spacing w:after="160"/>
+        <w:ind w:left="480"/>
+      </w:pPr>
+      <w:r>
+        <w:rPr>
+          <w:i/>
+          <w:iCs/>
+        </w:rPr>
+        <w:t xml:space="preserve">hay algo que se te ocurra para mejorarla en algo? Para que se mas intuitiva o incluso mas automatica, o lo que sea</w:t>
+      </w:r>
+    </w:p>
+    <w:p>
+      <w:pPr>
+        <w:spacing w:after="120" w:before="120"/>
+      </w:pPr>
+      <w:r>
+        <w:rPr>
+          <w:b/>
+          <w:bCs/>
+        </w:rPr>
+        <w:t xml:space="preserve">Resultado y ajustes:</w:t>
+      </w:r>
+    </w:p>
+    <w:p>
+      <w:pPr>
+        <w:pStyle w:val="ListParagraph"/>
+        <w:numPr>
+          <w:ilvl w:val="0"/>
+          <w:numId w:val="2"/>
+        </w:numPr>
+        <w:spacing w:after="100"/>
+      </w:pPr>
+      <w:r>
+        <w:t xml:space="preserve">La IA propuso cinco mejoras (anotar capturas, resumen ejecutivo en el informe, merge de respaldos JSON, campo pantalla/flujo, multi-captura) y elegimos tres: anotar capturas, resumen ejecutivo y campo pantalla/flujo + multi-captura.</w:t>
+      </w:r>
+    </w:p>
+    <w:p>
+      <w:pPr>
+        <w:pStyle w:val="ListParagraph"/>
+        <w:numPr>
+          <w:ilvl w:val="0"/>
+          <w:numId w:val="2"/>
+        </w:numPr>
+        <w:spacing w:after="100"/>
+      </w:pPr>
+      <w:r>
+        <w:t xml:space="preserve">Implementó: un editor para dibujar recuadros y flechas rojas sobre la captura y señalar el punto exacto de la interfaz (con deshacer y “quitar marcas”, que restaura la imagen original); un resumen ejecutivo al inicio del informe (leyes cumplidas/rotas, heurísticas con problemas, catástrofes, y una tabla con la severidad de las 10 heurísticas); un campo “pantalla o flujo analizado” en cada tarjeta; y soporte para varias capturas por tarjeta, manteniendo compatibilidad con los respaldos del formato anterior.</w:t>
+      </w:r>
+    </w:p>
+    <w:p>
+      <w:pPr>
+        <w:pStyle w:val="ListParagraph"/>
+        <w:numPr>
+          <w:ilvl w:val="0"/>
+          <w:numId w:val="2"/>
+        </w:numPr>
+        <w:spacing w:after="100"/>
+      </w:pPr>
+      <w:r>
+        <w:rPr>
+          <w:b/>
+          <w:bCs/>
+        </w:rPr>
+        <w:t xml:space="preserve">Ajustes: </w:t>
+      </w:r>
+      <w:r>
+        <w:t xml:space="preserve">en esta iteración no hubo errores de compilación; la IA verificó todo en el navegador (dibujó una anotación real con el mouse, recargó para confirmar la persistencia y revisó el resumen del informe) antes de hacer el deploy.</w:t>
       </w:r>
     </w:p>
     <w:p>

</xml_diff>